<commit_message>
Methods 4.10: systematic dataset catalogue + new Table 3
Restructured benchmark-datasets section into an enumerated catalogue:
7 simulated families (exact truth), 8 real-genome datasets, and the
GTDB-R207/CAMI2 sampling frames, each with composition, ground truth,
and provenance. New Table 3 summarizes all 15 datasets with their
analyses. Also fixes an error: the oral/gut set is 50 genomes across
10 species (5 oral + 5 gut, 5 genomes each), not 50 species.
</commit_message>
<xml_diff>
--- a/paper/manuscript.docx
+++ b/paper/manuscript.docx
@@ -2708,104 +2708,253 @@
         <w:pStyle w:val="FirstParagraph"/>
       </w:pPr>
       <w:r>
-        <w:rPr>
-          <w:b/>
-          <w:bCs/>
-        </w:rPr>
-        <w:t xml:space="preserve">GTDB-ANIm benchmark.</w:t>
-      </w:r>
-      <w:r>
-        <w:t xml:space="preserve"> </w:t>
-      </w:r>
-      <w:r>
-        <w:t xml:space="preserve">2,074 genome pairs from GTDB release R207 representatives [11,12], stratified across ANI bands and phyla; truth is ANIm computed as dnadiff (MUMmer 3.23) 1-to-1. The 95–99.5% expansion pairs (n = 467) were selected by screening all 2.26 M same-genus pairs with skani and running dnadiff on 650 candidates.</w:t>
-      </w:r>
-      <w:r>
-        <w:t xml:space="preserve"> </w:t>
-      </w:r>
-      <w:r>
-        <w:rPr>
-          <w:b/>
-          <w:bCs/>
-        </w:rPr>
-        <w:t xml:space="preserve">Mid-ANI set.</w:t>
-      </w:r>
-      <w:r>
-        <w:t xml:space="preserve"> </w:t>
-      </w:r>
-      <w:r>
-        <w:t xml:space="preserve">15 pairs (</w:t>
+        <w:t xml:space="preserve">All datasets used in this study, their composition, ground truth, and the analyses they support are summarized in Table 3; the generation framework for the simulated families is Methods 4.9.</w:t>
+      </w:r>
+    </w:p>
+    <w:p>
+      <w:pPr>
+        <w:pStyle w:val="BodyText"/>
+      </w:pPr>
+      <w:r>
+        <w:rPr>
+          <w:b/>
+          <w:bCs/>
+        </w:rPr>
+        <w:t xml:space="preserve">Simulated datasets (exact truth by construction).</w:t>
+      </w:r>
+      <w:r>
+        <w:t xml:space="preserve"> </w:t>
+      </w:r>
+      <w:r>
+        <w:t xml:space="preserve">Seven families, all evolved from</w:t>
+      </w:r>
+      <w:r>
+        <w:t xml:space="preserve"> </w:t>
       </w:r>
       <w:r>
         <w:rPr>
           <w:i/>
           <w:iCs/>
         </w:rPr>
-        <w:t xml:space="preserve">B. longum × B. breve</w:t>
-      </w:r>
-      <w:r>
-        <w:t xml:space="preserve">,</w:t>
-      </w:r>
-      <w:r>
-        <w:t xml:space="preserve"> </w:t>
+        <w:t xml:space="preserve">E. coli</w:t>
+      </w:r>
+      <w:r>
+        <w:t xml:space="preserve"> </w:t>
+      </w:r>
+      <w:r>
+        <w:t xml:space="preserve">K-12 MG1655 except the GC ladders: (i) the</w:t>
+      </w:r>
+      <w:r>
+        <w:t xml:space="preserve"> </w:t>
+      </w:r>
+      <w:r>
+        <w:rPr>
+          <w:b/>
+          <w:bCs/>
+        </w:rPr>
+        <w:t xml:space="preserve">ANI ladder</w:t>
+      </w:r>
+      <w:r>
+        <w:t xml:space="preserve"> </w:t>
+      </w:r>
+      <w:r>
+        <w:t xml:space="preserve">— 12 levels, 85–99.9%, each genome carrying a 400 kb inversion, generated with and without ~46 deletions of 200–2,000 bp; (ii) the</w:t>
+      </w:r>
+      <w:r>
+        <w:t xml:space="preserve"> </w:t>
+      </w:r>
+      <w:r>
+        <w:rPr>
+          <w:b/>
+          <w:bCs/>
+        </w:rPr>
+        <w:t xml:space="preserve">indel sweep</w:t>
+      </w:r>
+      <w:r>
+        <w:t xml:space="preserve"> </w:t>
+      </w:r>
+      <w:r>
+        <w:t xml:space="preserve">— ANI 95.000, 0–4 deletions per 100 kb; (iii) the</w:t>
+      </w:r>
+      <w:r>
+        <w:t xml:space="preserve"> </w:t>
+      </w:r>
+      <w:r>
+        <w:rPr>
+          <w:b/>
+          <w:bCs/>
+        </w:rPr>
+        <w:t xml:space="preserve">fragmentation ladder</w:t>
+      </w:r>
+      <w:r>
+        <w:t xml:space="preserve"> </w:t>
+      </w:r>
+      <w:r>
+        <w:t xml:space="preserve">— 20–201 contigs, ~50% reverse-complemented, order shuffled, no sequence lost; (iv) the</w:t>
+      </w:r>
+      <w:r>
+        <w:t xml:space="preserve"> </w:t>
+      </w:r>
+      <w:r>
+        <w:rPr>
+          <w:b/>
+          <w:bCs/>
+        </w:rPr>
+        <w:t xml:space="preserve">accessory-fraction sweep</w:t>
+      </w:r>
+      <w:r>
+        <w:t xml:space="preserve"> </w:t>
+      </w:r>
+      <w:r>
+        <w:t xml:space="preserve">— core ANI 95.000 with 0–50% of the genome replaced by composition-preserving shuffled blocks, plus a block-count control at fixed total fraction; (v) the</w:t>
+      </w:r>
+      <w:r>
+        <w:t xml:space="preserve"> </w:t>
+      </w:r>
+      <w:r>
+        <w:rPr>
+          <w:b/>
+          <w:bCs/>
+        </w:rPr>
+        <w:t xml:space="preserve">mosaic/rate-heterogeneity family</w:t>
+      </w:r>
+      <w:r>
+        <w:t xml:space="preserve"> </w:t>
+      </w:r>
+      <w:r>
+        <w:t xml:space="preserve">— per-block rates ~ Gamma(α, α), α = 0.5/1/2, mean ANI 90–98, plus deliberately misspecified bimodal cases (19 used in the identifiability analysis of Methods 4.7); (vi) the</w:t>
+      </w:r>
+      <w:r>
+        <w:t xml:space="preserve"> </w:t>
+      </w:r>
+      <w:r>
+        <w:rPr>
+          <w:b/>
+          <w:bCs/>
+        </w:rPr>
+        <w:t xml:space="preserve">GC ladders</w:t>
+      </w:r>
+      <w:r>
+        <w:t xml:space="preserve"> </w:t>
+      </w:r>
+      <w:r>
+        <w:t xml:space="preserve">— substitution ladders on five real template genomes spanning GC 27.2–72.1%; and (vii) the</w:t>
+      </w:r>
+      <w:r>
+        <w:t xml:space="preserve"> </w:t>
+      </w:r>
+      <w:r>
+        <w:rPr>
+          <w:b/>
+          <w:bCs/>
+        </w:rPr>
+        <w:t xml:space="preserve">inversion ladder</w:t>
+      </w:r>
+      <w:r>
+        <w:t xml:space="preserve"> </w:t>
+      </w:r>
+      <w:r>
+        <w:t xml:space="preserve">for synteny validation — ANI 95.00/98.00 with 0–32 non-overlapping inversions of 100–400 kb (2 exact breakpoints each;</w:t>
+      </w:r>
+      <w:r>
+        <w:t xml:space="preserve"> </w:t>
+      </w:r>
+      <w:r>
+        <w:rPr>
+          <w:rStyle w:val="VerbatimChar"/>
+        </w:rPr>
+        <w:t xml:space="preserve">scripts/synteny_bench/</w:t>
+      </w:r>
+      <w:r>
+        <w:t xml:space="preserve">).</w:t>
+      </w:r>
+    </w:p>
+    <w:p>
+      <w:pPr>
+        <w:pStyle w:val="BodyText"/>
+      </w:pPr>
+      <w:r>
+        <w:rPr>
+          <w:b/>
+          <w:bCs/>
+        </w:rPr>
+        <w:t xml:space="preserve">Real-genome datasets. (1) GTDB-ANIm benchmark.</w:t>
+      </w:r>
+      <w:r>
+        <w:t xml:space="preserve"> </w:t>
+      </w:r>
+      <w:r>
+        <w:t xml:space="preserve">2,074 genome pairs from GTDB release R207 representatives [11,12], stratified across ANI bands and phyla (band sizes 475/837/690/72 for 80–85/85–90/90–95/95–99); truth is ANIm computed as dnadiff (MUMmer 3.23) 1-to-1.</w:t>
+      </w:r>
+      <w:r>
+        <w:t xml:space="preserve"> </w:t>
+      </w:r>
+      <w:r>
+        <w:rPr>
+          <w:b/>
+          <w:bCs/>
+        </w:rPr>
+        <w:t xml:space="preserve">(2) 95–99.5% ANIm expansion.</w:t>
+      </w:r>
+      <w:r>
+        <w:t xml:space="preserve"> </w:t>
+      </w:r>
+      <w:r>
+        <w:t xml:space="preserve">These 467 pairs (607 species, 26 phyla, no overlap with the benchmark set) were selected by screening all 2.26 M same-genus pairs with skani and running dnadiff on 650 candidates; together with the benchmark set they form the 2,520-pair calibration training matrix.</w:t>
+      </w:r>
+      <w:r>
+        <w:t xml:space="preserve"> </w:t>
+      </w:r>
+      <w:r>
+        <w:rPr>
+          <w:b/>
+          <w:bCs/>
+        </w:rPr>
+        <w:t xml:space="preserve">(3) GTDB scale set.</w:t>
+      </w:r>
+      <w:r>
+        <w:t xml:space="preserve"> </w:t>
+      </w:r>
+      <w:r>
+        <w:t xml:space="preserve">45,000 pairs sampled from GTDB-R207 metadata with stratification by taxonomic level (intra-species / intra-genus / intra-family / random;</w:t>
+      </w:r>
+      <w:r>
+        <w:t xml:space="preserve"> </w:t>
+      </w:r>
+      <w:r>
+        <w:rPr>
+          <w:rStyle w:val="VerbatimChar"/>
+        </w:rPr>
+        <w:t xml:space="preserve">scripts/sample_gtdb_pairs.py</w:t>
+      </w:r>
+      <w:r>
+        <w:t xml:space="preserve">, seed-fixed); used for the large-scale FastANI comparison, of which FastANI reports 672 pairs.</w:t>
+      </w:r>
+      <w:r>
+        <w:t xml:space="preserve"> </w:t>
+      </w:r>
+      <w:r>
+        <w:rPr>
+          <w:b/>
+          <w:bCs/>
+        </w:rPr>
+        <w:t xml:space="preserve">(4) Mid-ANI set.</w:t>
+      </w:r>
+      <w:r>
+        <w:t xml:space="preserve"> </w:t>
+      </w:r>
+      <w:r>
+        <w:t xml:space="preserve">15 pairs (</w:t>
       </w:r>
       <w:r>
         <w:rPr>
           <w:i/>
           <w:iCs/>
         </w:rPr>
-        <w:t xml:space="preserve">V. parvula × V. dispar</w:t>
-      </w:r>
-      <w:r>
-        <w:t xml:space="preserve">), ANIm truth 87.6–90.2%; ANIm alignment coverage is only 46–72% of these genomes.</w:t>
-      </w:r>
-      <w:r>
-        <w:t xml:space="preserve"> </w:t>
-      </w:r>
-      <w:r>
-        <w:rPr>
-          <w:b/>
-          <w:bCs/>
-        </w:rPr>
-        <w:t xml:space="preserve">Oral/gut set.</w:t>
-      </w:r>
-      <w:r>
-        <w:t xml:space="preserve"> </w:t>
-      </w:r>
-      <w:r>
-        <w:t xml:space="preserve">1,225 pairs across 50 species; the 100 same-species pairs serve as the external near-clonal benchmark against FastANI.</w:t>
-      </w:r>
-      <w:r>
-        <w:t xml:space="preserve"> </w:t>
-      </w:r>
-      <w:r>
-        <w:rPr>
-          <w:b/>
-          <w:bCs/>
-        </w:rPr>
-        <w:t xml:space="preserve">Enterobacteriaceae completes.</w:t>
-      </w:r>
-      <w:r>
-        <w:t xml:space="preserve"> </w:t>
-      </w:r>
-      <w:r>
-        <w:t xml:space="preserve">13 chromosomes vs K-12 MG1655.</w:t>
-      </w:r>
-      <w:r>
-        <w:t xml:space="preserve"> </w:t>
-      </w:r>
-      <w:r>
-        <w:rPr>
-          <w:b/>
-          <w:bCs/>
-        </w:rPr>
-        <w:t xml:space="preserve">Real drafts.</w:t>
-      </w:r>
-      <w:r>
-        <w:t xml:space="preserve"> </w:t>
-      </w:r>
-      <w:r>
-        <w:t xml:space="preserve">8</w:t>
+        <w:t xml:space="preserve">B. longum × B. breve</w:t>
+      </w:r>
+      <w:r>
+        <w:t xml:space="preserve">,</w:t>
       </w:r>
       <w:r>
         <w:t xml:space="preserve"> </w:t>
@@ -2815,6 +2964,191 @@
           <w:i/>
           <w:iCs/>
         </w:rPr>
+        <w:t xml:space="preserve">V. parvula × V. dispar</w:t>
+      </w:r>
+      <w:r>
+        <w:t xml:space="preserve">), ANIm truth 87.6–90.2%; ANIm alignment coverage is only 46–72% of these genomes.</w:t>
+      </w:r>
+      <w:r>
+        <w:t xml:space="preserve"> </w:t>
+      </w:r>
+      <w:r>
+        <w:rPr>
+          <w:b/>
+          <w:bCs/>
+        </w:rPr>
+        <w:t xml:space="preserve">(5) Oral/gut set.</w:t>
+      </w:r>
+      <w:r>
+        <w:t xml:space="preserve"> </w:t>
+      </w:r>
+      <w:r>
+        <w:t xml:space="preserve">50 isolate genomes from 10 species — 5 oral (</w:t>
+      </w:r>
+      <w:r>
+        <w:rPr>
+          <w:i/>
+          <w:iCs/>
+        </w:rPr>
+        <w:t xml:space="preserve">A. actinomycetemcomitans</w:t>
+      </w:r>
+      <w:r>
+        <w:t xml:space="preserve">,</w:t>
+      </w:r>
+      <w:r>
+        <w:t xml:space="preserve"> </w:t>
+      </w:r>
+      <w:r>
+        <w:rPr>
+          <w:i/>
+          <w:iCs/>
+        </w:rPr>
+        <w:t xml:space="preserve">F. nucleatum</w:t>
+      </w:r>
+      <w:r>
+        <w:t xml:space="preserve">,</w:t>
+      </w:r>
+      <w:r>
+        <w:t xml:space="preserve"> </w:t>
+      </w:r>
+      <w:r>
+        <w:rPr>
+          <w:i/>
+          <w:iCs/>
+        </w:rPr>
+        <w:t xml:space="preserve">P. gingivalis</w:t>
+      </w:r>
+      <w:r>
+        <w:t xml:space="preserve">,</w:t>
+      </w:r>
+      <w:r>
+        <w:t xml:space="preserve"> </w:t>
+      </w:r>
+      <w:r>
+        <w:rPr>
+          <w:i/>
+          <w:iCs/>
+        </w:rPr>
+        <w:t xml:space="preserve">S. mutans</w:t>
+      </w:r>
+      <w:r>
+        <w:t xml:space="preserve">,</w:t>
+      </w:r>
+      <w:r>
+        <w:t xml:space="preserve"> </w:t>
+      </w:r>
+      <w:r>
+        <w:rPr>
+          <w:i/>
+          <w:iCs/>
+        </w:rPr>
+        <w:t xml:space="preserve">S. sanguinis</w:t>
+      </w:r>
+      <w:r>
+        <w:t xml:space="preserve">) and 5 gut (</w:t>
+      </w:r>
+      <w:r>
+        <w:rPr>
+          <w:i/>
+          <w:iCs/>
+        </w:rPr>
+        <w:t xml:space="preserve">A. muciniphila</w:t>
+      </w:r>
+      <w:r>
+        <w:t xml:space="preserve">,</w:t>
+      </w:r>
+      <w:r>
+        <w:t xml:space="preserve"> </w:t>
+      </w:r>
+      <w:r>
+        <w:rPr>
+          <w:i/>
+          <w:iCs/>
+        </w:rPr>
+        <w:t xml:space="preserve">B. fragilis</w:t>
+      </w:r>
+      <w:r>
+        <w:t xml:space="preserve">,</w:t>
+      </w:r>
+      <w:r>
+        <w:t xml:space="preserve"> </w:t>
+      </w:r>
+      <w:r>
+        <w:rPr>
+          <w:i/>
+          <w:iCs/>
+        </w:rPr>
+        <w:t xml:space="preserve">B. longum</w:t>
+      </w:r>
+      <w:r>
+        <w:t xml:space="preserve">,</w:t>
+      </w:r>
+      <w:r>
+        <w:t xml:space="preserve"> </w:t>
+      </w:r>
+      <w:r>
+        <w:rPr>
+          <w:i/>
+          <w:iCs/>
+        </w:rPr>
+        <w:t xml:space="preserve">F. prausnitzii</w:t>
+      </w:r>
+      <w:r>
+        <w:t xml:space="preserve">,</w:t>
+      </w:r>
+      <w:r>
+        <w:t xml:space="preserve"> </w:t>
+      </w:r>
+      <w:r>
+        <w:rPr>
+          <w:i/>
+          <w:iCs/>
+        </w:rPr>
+        <w:t xml:space="preserve">R. intestinalis</w:t>
+      </w:r>
+      <w:r>
+        <w:t xml:space="preserve">), 5 genomes per species — compared all-vs-all (1,225 pairs); the 100 same-species pairs serve as the external near-clonal benchmark against FastANI and skani, and 1,100 cross-species pairs probe the below-detection regime.</w:t>
+      </w:r>
+      <w:r>
+        <w:t xml:space="preserve"> </w:t>
+      </w:r>
+      <w:r>
+        <w:rPr>
+          <w:b/>
+          <w:bCs/>
+        </w:rPr>
+        <w:t xml:space="preserve">(6) Enterobacteriaceae completes.</w:t>
+      </w:r>
+      <w:r>
+        <w:t xml:space="preserve"> </w:t>
+      </w:r>
+      <w:r>
+        <w:t xml:space="preserve">13 chromosomes vs K-12 MG1655, spanning ANI ~81–99.99; three pairs (MG1655/W3110, MG1655/O157:H7 Sakai, Typhi CT18/Typhimurium LT2) double as the structural-variation validation set with dnadiff structural truth.</w:t>
+      </w:r>
+      <w:r>
+        <w:t xml:space="preserve"> </w:t>
+      </w:r>
+      <w:r>
+        <w:rPr>
+          <w:b/>
+          <w:bCs/>
+        </w:rPr>
+        <w:t xml:space="preserve">(7) Real drafts.</w:t>
+      </w:r>
+      <w:r>
+        <w:t xml:space="preserve"> </w:t>
+      </w:r>
+      <w:r>
+        <w:t xml:space="preserve">8</w:t>
+      </w:r>
+      <w:r>
+        <w:t xml:space="preserve"> </w:t>
+      </w:r>
+      <w:r>
+        <w:rPr>
+          <w:i/>
+          <w:iCs/>
+        </w:rPr>
         <w:t xml:space="preserve">E. coli</w:t>
       </w:r>
       <w:r>
@@ -2831,7 +3165,7 @@
           <w:b/>
           <w:bCs/>
         </w:rPr>
-        <w:t xml:space="preserve">CAMI2 MAG benchmark.</w:t>
+        <w:t xml:space="preserve">(8) CAMI2 MAG benchmark.</w:t>
       </w:r>
       <w:r>
         <w:t xml:space="preserve"> </w:t>
@@ -2853,6 +3187,22 @@
       </w:r>
       <w:r>
         <w:t xml:space="preserve">).</w:t>
+      </w:r>
+      <w:r>
+        <w:t xml:space="preserve"> </w:t>
+      </w:r>
+      <w:r>
+        <w:rPr>
+          <w:b/>
+          <w:bCs/>
+        </w:rPr>
+        <w:t xml:space="preserve">Databases.</w:t>
+      </w:r>
+      <w:r>
+        <w:t xml:space="preserve"> </w:t>
+      </w:r>
+      <w:r>
+        <w:t xml:space="preserve">GTDB release R207 (bac120/ar53 metadata and representative genomes) [11,12] is the sampling frame for datasets (1)–(3) and the source of the nearest-representative references used in the MAG pipeline; CAMI2 (strain-madness and marine short-read campaigns, with source genomes and per-read ground truth) is the sampling frame for dataset (8).</w:t>
       </w:r>
       <w:r>
         <w:t xml:space="preserve"> </w:t>
@@ -4416,6 +4766,1131 @@
             </w:pPr>
             <w:r>
               <w:t xml:space="preserve">0.133</w:t>
+            </w:r>
+          </w:p>
+        </w:tc>
+      </w:tr>
+    </w:tbl>
+    <w:p>
+      <w:pPr>
+        <w:pStyle w:val="BodyText"/>
+      </w:pPr>
+      <w:r>
+        <w:rPr>
+          <w:b/>
+          <w:bCs/>
+        </w:rPr>
+        <w:t xml:space="preserve">Table 3 — Datasets used in this study.</w:t>
+      </w:r>
+      <w:r>
+        <w:t xml:space="preserve"> </w:t>
+      </w:r>
+      <w:r>
+        <w:t xml:space="preserve">Simulated datasets carry exact truth by construction (counted substitutions; Methods 4.9); real datasets use dnadiff (ANIm or structural) truth unless noted. Figure numbers refer to the main text.</w:t>
+      </w:r>
+    </w:p>
+    <w:tbl>
+      <w:tblPr>
+        <w:tblStyle w:val="Table"/>
+        <w:tblW w:type="pct" w:w="5000"/>
+        <w:tblLayout w:type="fixed"/>
+        <w:tblLook w:firstRow="1" w:lastRow="0" w:firstColumn="0" w:lastColumn="0" w:noHBand="0" w:noVBand="0" w:val="0020"/>
+      </w:tblPr>
+      <w:tblGrid>
+        <w:gridCol w:w="1320"/>
+        <w:gridCol w:w="1320"/>
+        <w:gridCol w:w="1320"/>
+        <w:gridCol w:w="1320"/>
+        <w:gridCol w:w="1320"/>
+        <w:gridCol w:w="1320"/>
+      </w:tblGrid>
+      <w:tr>
+        <w:trPr>
+          <w:tblHeader w:val="on"/>
+        </w:trPr>
+        <w:tc>
+          <w:tcPr/>
+          <w:p>
+            <w:pPr>
+              <w:pStyle w:val="Compact"/>
+            </w:pPr>
+            <w:r>
+              <w:t xml:space="preserve">#</w:t>
+            </w:r>
+          </w:p>
+        </w:tc>
+        <w:tc>
+          <w:tcPr/>
+          <w:p>
+            <w:pPr>
+              <w:pStyle w:val="Compact"/>
+            </w:pPr>
+            <w:r>
+              <w:t xml:space="preserve">Dataset</w:t>
+            </w:r>
+          </w:p>
+        </w:tc>
+        <w:tc>
+          <w:tcPr/>
+          <w:p>
+            <w:pPr>
+              <w:pStyle w:val="Compact"/>
+            </w:pPr>
+            <w:r>
+              <w:t xml:space="preserve">Type</w:t>
+            </w:r>
+          </w:p>
+        </w:tc>
+        <w:tc>
+          <w:tcPr/>
+          <w:p>
+            <w:pPr>
+              <w:pStyle w:val="Compact"/>
+            </w:pPr>
+            <w:r>
+              <w:t xml:space="preserve">Composition</w:t>
+            </w:r>
+          </w:p>
+        </w:tc>
+        <w:tc>
+          <w:tcPr/>
+          <w:p>
+            <w:pPr>
+              <w:pStyle w:val="Compact"/>
+            </w:pPr>
+            <w:r>
+              <w:t xml:space="preserve">Ground truth</w:t>
+            </w:r>
+          </w:p>
+        </w:tc>
+        <w:tc>
+          <w:tcPr/>
+          <w:p>
+            <w:pPr>
+              <w:pStyle w:val="Compact"/>
+            </w:pPr>
+            <w:r>
+              <w:t xml:space="preserve">Used in</w:t>
+            </w:r>
+          </w:p>
+        </w:tc>
+      </w:tr>
+      <w:tr>
+        <w:tc>
+          <w:tcPr/>
+          <w:p>
+            <w:pPr>
+              <w:pStyle w:val="Compact"/>
+            </w:pPr>
+            <w:r>
+              <w:t xml:space="preserve">1</w:t>
+            </w:r>
+          </w:p>
+        </w:tc>
+        <w:tc>
+          <w:tcPr/>
+          <w:p>
+            <w:pPr>
+              <w:pStyle w:val="Compact"/>
+            </w:pPr>
+            <w:r>
+              <w:t xml:space="preserve">ANI ladder</w:t>
+            </w:r>
+          </w:p>
+        </w:tc>
+        <w:tc>
+          <w:tcPr/>
+          <w:p>
+            <w:pPr>
+              <w:pStyle w:val="Compact"/>
+            </w:pPr>
+            <w:r>
+              <w:t xml:space="preserve">simulated</w:t>
+            </w:r>
+          </w:p>
+        </w:tc>
+        <w:tc>
+          <w:tcPr/>
+          <w:p>
+            <w:pPr>
+              <w:pStyle w:val="Compact"/>
+            </w:pPr>
+            <w:r>
+              <w:t xml:space="preserve">12 levels, 85–99.9% ANI; 400 kb inversion; ± ~46 deletions</w:t>
+            </w:r>
+          </w:p>
+        </w:tc>
+        <w:tc>
+          <w:tcPr/>
+          <w:p>
+            <w:pPr>
+              <w:pStyle w:val="Compact"/>
+            </w:pPr>
+            <w:r>
+              <w:t xml:space="preserve">exact</w:t>
+            </w:r>
+          </w:p>
+        </w:tc>
+        <w:tc>
+          <w:tcPr/>
+          <w:p>
+            <w:pPr>
+              <w:pStyle w:val="Compact"/>
+            </w:pPr>
+            <w:r>
+              <w:t xml:space="preserve">Fig. 2</w:t>
+            </w:r>
+          </w:p>
+        </w:tc>
+      </w:tr>
+      <w:tr>
+        <w:tc>
+          <w:tcPr/>
+          <w:p>
+            <w:pPr>
+              <w:pStyle w:val="Compact"/>
+            </w:pPr>
+            <w:r>
+              <w:t xml:space="preserve">2</w:t>
+            </w:r>
+          </w:p>
+        </w:tc>
+        <w:tc>
+          <w:tcPr/>
+          <w:p>
+            <w:pPr>
+              <w:pStyle w:val="Compact"/>
+            </w:pPr>
+            <w:r>
+              <w:t xml:space="preserve">Indel sweep</w:t>
+            </w:r>
+          </w:p>
+        </w:tc>
+        <w:tc>
+          <w:tcPr/>
+          <w:p>
+            <w:pPr>
+              <w:pStyle w:val="Compact"/>
+            </w:pPr>
+            <w:r>
+              <w:t xml:space="preserve">simulated</w:t>
+            </w:r>
+          </w:p>
+        </w:tc>
+        <w:tc>
+          <w:tcPr/>
+          <w:p>
+            <w:pPr>
+              <w:pStyle w:val="Compact"/>
+            </w:pPr>
+            <w:r>
+              <w:t xml:space="preserve">ANI 95.000; 0–4 deletions/100 kb</w:t>
+            </w:r>
+          </w:p>
+        </w:tc>
+        <w:tc>
+          <w:tcPr/>
+          <w:p>
+            <w:pPr>
+              <w:pStyle w:val="Compact"/>
+            </w:pPr>
+            <w:r>
+              <w:t xml:space="preserve">exact</w:t>
+            </w:r>
+          </w:p>
+        </w:tc>
+        <w:tc>
+          <w:tcPr/>
+          <w:p>
+            <w:pPr>
+              <w:pStyle w:val="Compact"/>
+            </w:pPr>
+            <w:r>
+              <w:t xml:space="preserve">Fig. 3a</w:t>
+            </w:r>
+          </w:p>
+        </w:tc>
+      </w:tr>
+      <w:tr>
+        <w:tc>
+          <w:tcPr/>
+          <w:p>
+            <w:pPr>
+              <w:pStyle w:val="Compact"/>
+            </w:pPr>
+            <w:r>
+              <w:t xml:space="preserve">3</w:t>
+            </w:r>
+          </w:p>
+        </w:tc>
+        <w:tc>
+          <w:tcPr/>
+          <w:p>
+            <w:pPr>
+              <w:pStyle w:val="Compact"/>
+            </w:pPr>
+            <w:r>
+              <w:t xml:space="preserve">Fragmentation ladder</w:t>
+            </w:r>
+          </w:p>
+        </w:tc>
+        <w:tc>
+          <w:tcPr/>
+          <w:p>
+            <w:pPr>
+              <w:pStyle w:val="Compact"/>
+            </w:pPr>
+            <w:r>
+              <w:t xml:space="preserve">simulated</w:t>
+            </w:r>
+          </w:p>
+        </w:tc>
+        <w:tc>
+          <w:tcPr/>
+          <w:p>
+            <w:pPr>
+              <w:pStyle w:val="Compact"/>
+            </w:pPr>
+            <w:r>
+              <w:t xml:space="preserve">20–201 contigs; ~50% reverse-complemented</w:t>
+            </w:r>
+          </w:p>
+        </w:tc>
+        <w:tc>
+          <w:tcPr/>
+          <w:p>
+            <w:pPr>
+              <w:pStyle w:val="Compact"/>
+            </w:pPr>
+            <w:r>
+              <w:t xml:space="preserve">exact</w:t>
+            </w:r>
+          </w:p>
+        </w:tc>
+        <w:tc>
+          <w:tcPr/>
+          <w:p>
+            <w:pPr>
+              <w:pStyle w:val="Compact"/>
+            </w:pPr>
+            <w:r>
+              <w:t xml:space="preserve">Fig. 3b</w:t>
+            </w:r>
+          </w:p>
+        </w:tc>
+      </w:tr>
+      <w:tr>
+        <w:tc>
+          <w:tcPr/>
+          <w:p>
+            <w:pPr>
+              <w:pStyle w:val="Compact"/>
+            </w:pPr>
+            <w:r>
+              <w:t xml:space="preserve">4</w:t>
+            </w:r>
+          </w:p>
+        </w:tc>
+        <w:tc>
+          <w:tcPr/>
+          <w:p>
+            <w:pPr>
+              <w:pStyle w:val="Compact"/>
+            </w:pPr>
+            <w:r>
+              <w:t xml:space="preserve">GC ladders</w:t>
+            </w:r>
+          </w:p>
+        </w:tc>
+        <w:tc>
+          <w:tcPr/>
+          <w:p>
+            <w:pPr>
+              <w:pStyle w:val="Compact"/>
+            </w:pPr>
+            <w:r>
+              <w:t xml:space="preserve">simulated</w:t>
+            </w:r>
+          </w:p>
+        </w:tc>
+        <w:tc>
+          <w:tcPr/>
+          <w:p>
+            <w:pPr>
+              <w:pStyle w:val="Compact"/>
+            </w:pPr>
+            <w:r>
+              <w:t xml:space="preserve">5 real templates, GC 27.2–72.1%</w:t>
+            </w:r>
+          </w:p>
+        </w:tc>
+        <w:tc>
+          <w:tcPr/>
+          <w:p>
+            <w:pPr>
+              <w:pStyle w:val="Compact"/>
+            </w:pPr>
+            <w:r>
+              <w:t xml:space="preserve">exact</w:t>
+            </w:r>
+          </w:p>
+        </w:tc>
+        <w:tc>
+          <w:tcPr/>
+          <w:p>
+            <w:pPr>
+              <w:pStyle w:val="Compact"/>
+            </w:pPr>
+            <w:r>
+              <w:t xml:space="preserve">Fig. 3c</w:t>
+            </w:r>
+          </w:p>
+        </w:tc>
+      </w:tr>
+      <w:tr>
+        <w:tc>
+          <w:tcPr/>
+          <w:p>
+            <w:pPr>
+              <w:pStyle w:val="Compact"/>
+            </w:pPr>
+            <w:r>
+              <w:t xml:space="preserve">5</w:t>
+            </w:r>
+          </w:p>
+        </w:tc>
+        <w:tc>
+          <w:tcPr/>
+          <w:p>
+            <w:pPr>
+              <w:pStyle w:val="Compact"/>
+            </w:pPr>
+            <w:r>
+              <w:t xml:space="preserve">Accessory sweep</w:t>
+            </w:r>
+          </w:p>
+        </w:tc>
+        <w:tc>
+          <w:tcPr/>
+          <w:p>
+            <w:pPr>
+              <w:pStyle w:val="Compact"/>
+            </w:pPr>
+            <w:r>
+              <w:t xml:space="preserve">simulated</w:t>
+            </w:r>
+          </w:p>
+        </w:tc>
+        <w:tc>
+          <w:tcPr/>
+          <w:p>
+            <w:pPr>
+              <w:pStyle w:val="Compact"/>
+            </w:pPr>
+            <w:r>
+              <w:t xml:space="preserve">core ANI 95.000; 0–50% shuffled accessory</w:t>
+            </w:r>
+          </w:p>
+        </w:tc>
+        <w:tc>
+          <w:tcPr/>
+          <w:p>
+            <w:pPr>
+              <w:pStyle w:val="Compact"/>
+            </w:pPr>
+            <w:r>
+              <w:t xml:space="preserve">exact</w:t>
+            </w:r>
+          </w:p>
+        </w:tc>
+        <w:tc>
+          <w:tcPr/>
+          <w:p>
+            <w:pPr>
+              <w:pStyle w:val="Compact"/>
+            </w:pPr>
+            <w:r>
+              <w:t xml:space="preserve">Fig. 3d</w:t>
+            </w:r>
+          </w:p>
+        </w:tc>
+      </w:tr>
+      <w:tr>
+        <w:tc>
+          <w:tcPr/>
+          <w:p>
+            <w:pPr>
+              <w:pStyle w:val="Compact"/>
+            </w:pPr>
+            <w:r>
+              <w:t xml:space="preserve">6</w:t>
+            </w:r>
+          </w:p>
+        </w:tc>
+        <w:tc>
+          <w:tcPr/>
+          <w:p>
+            <w:pPr>
+              <w:pStyle w:val="Compact"/>
+            </w:pPr>
+            <w:r>
+              <w:t xml:space="preserve">Mosaic / rate-heterogeneity</w:t>
+            </w:r>
+          </w:p>
+        </w:tc>
+        <w:tc>
+          <w:tcPr/>
+          <w:p>
+            <w:pPr>
+              <w:pStyle w:val="Compact"/>
+            </w:pPr>
+            <w:r>
+              <w:t xml:space="preserve">simulated</w:t>
+            </w:r>
+          </w:p>
+        </w:tc>
+        <w:tc>
+          <w:tcPr/>
+          <w:p>
+            <w:pPr>
+              <w:pStyle w:val="Compact"/>
+            </w:pPr>
+            <w:r>
+              <w:t xml:space="preserve">Gamma(α,α), α = 0.5/1/2, ANI 90–98 + bimodal</w:t>
+            </w:r>
+          </w:p>
+        </w:tc>
+        <w:tc>
+          <w:tcPr/>
+          <w:p>
+            <w:pPr>
+              <w:pStyle w:val="Compact"/>
+            </w:pPr>
+            <w:r>
+              <w:t xml:space="preserve">exact</w:t>
+            </w:r>
+          </w:p>
+        </w:tc>
+        <w:tc>
+          <w:tcPr/>
+          <w:p>
+            <w:pPr>
+              <w:pStyle w:val="Compact"/>
+            </w:pPr>
+            <w:r>
+              <w:t xml:space="preserve">Results 2.5, Methods 4.7</w:t>
+            </w:r>
+          </w:p>
+        </w:tc>
+      </w:tr>
+      <w:tr>
+        <w:tc>
+          <w:tcPr/>
+          <w:p>
+            <w:pPr>
+              <w:pStyle w:val="Compact"/>
+            </w:pPr>
+            <w:r>
+              <w:t xml:space="preserve">7</w:t>
+            </w:r>
+          </w:p>
+        </w:tc>
+        <w:tc>
+          <w:tcPr/>
+          <w:p>
+            <w:pPr>
+              <w:pStyle w:val="Compact"/>
+            </w:pPr>
+            <w:r>
+              <w:t xml:space="preserve">Inversion ladder</w:t>
+            </w:r>
+          </w:p>
+        </w:tc>
+        <w:tc>
+          <w:tcPr/>
+          <w:p>
+            <w:pPr>
+              <w:pStyle w:val="Compact"/>
+            </w:pPr>
+            <w:r>
+              <w:t xml:space="preserve">simulated</w:t>
+            </w:r>
+          </w:p>
+        </w:tc>
+        <w:tc>
+          <w:tcPr/>
+          <w:p>
+            <w:pPr>
+              <w:pStyle w:val="Compact"/>
+            </w:pPr>
+            <w:r>
+              <w:t xml:space="preserve">ANI 95/98; 0–32 inversions (2 breakpoints each)</w:t>
+            </w:r>
+          </w:p>
+        </w:tc>
+        <w:tc>
+          <w:tcPr/>
+          <w:p>
+            <w:pPr>
+              <w:pStyle w:val="Compact"/>
+            </w:pPr>
+            <w:r>
+              <w:t xml:space="preserve">exact</w:t>
+            </w:r>
+          </w:p>
+        </w:tc>
+        <w:tc>
+          <w:tcPr/>
+          <w:p>
+            <w:pPr>
+              <w:pStyle w:val="Compact"/>
+            </w:pPr>
+            <w:r>
+              <w:t xml:space="preserve">Fig. S1</w:t>
+            </w:r>
+          </w:p>
+        </w:tc>
+      </w:tr>
+      <w:tr>
+        <w:tc>
+          <w:tcPr/>
+          <w:p>
+            <w:pPr>
+              <w:pStyle w:val="Compact"/>
+            </w:pPr>
+            <w:r>
+              <w:t xml:space="preserve">8</w:t>
+            </w:r>
+          </w:p>
+        </w:tc>
+        <w:tc>
+          <w:tcPr/>
+          <w:p>
+            <w:pPr>
+              <w:pStyle w:val="Compact"/>
+            </w:pPr>
+            <w:r>
+              <w:t xml:space="preserve">GTDB-ANIm benchmark</w:t>
+            </w:r>
+          </w:p>
+        </w:tc>
+        <w:tc>
+          <w:tcPr/>
+          <w:p>
+            <w:pPr>
+              <w:pStyle w:val="Compact"/>
+            </w:pPr>
+            <w:r>
+              <w:t xml:space="preserve">real</w:t>
+            </w:r>
+          </w:p>
+        </w:tc>
+        <w:tc>
+          <w:tcPr/>
+          <w:p>
+            <w:pPr>
+              <w:pStyle w:val="Compact"/>
+            </w:pPr>
+            <w:r>
+              <w:t xml:space="preserve">2,074 GTDB-R207 pairs, 4 bands (475/837/690/72)</w:t>
+            </w:r>
+          </w:p>
+        </w:tc>
+        <w:tc>
+          <w:tcPr/>
+          <w:p>
+            <w:pPr>
+              <w:pStyle w:val="Compact"/>
+            </w:pPr>
+            <w:r>
+              <w:t xml:space="preserve">dnadiff ANIm</w:t>
+            </w:r>
+          </w:p>
+        </w:tc>
+        <w:tc>
+          <w:tcPr/>
+          <w:p>
+            <w:pPr>
+              <w:pStyle w:val="Compact"/>
+            </w:pPr>
+            <w:r>
+              <w:t xml:space="preserve">Fig. 8, Table 1</w:t>
+            </w:r>
+          </w:p>
+        </w:tc>
+      </w:tr>
+      <w:tr>
+        <w:tc>
+          <w:tcPr/>
+          <w:p>
+            <w:pPr>
+              <w:pStyle w:val="Compact"/>
+            </w:pPr>
+            <w:r>
+              <w:t xml:space="preserve">9</w:t>
+            </w:r>
+          </w:p>
+        </w:tc>
+        <w:tc>
+          <w:tcPr/>
+          <w:p>
+            <w:pPr>
+              <w:pStyle w:val="Compact"/>
+            </w:pPr>
+            <w:r>
+              <w:t xml:space="preserve">95–99.5% expansion</w:t>
+            </w:r>
+          </w:p>
+        </w:tc>
+        <w:tc>
+          <w:tcPr/>
+          <w:p>
+            <w:pPr>
+              <w:pStyle w:val="Compact"/>
+            </w:pPr>
+            <w:r>
+              <w:t xml:space="preserve">real</w:t>
+            </w:r>
+          </w:p>
+        </w:tc>
+        <w:tc>
+          <w:tcPr/>
+          <w:p>
+            <w:pPr>
+              <w:pStyle w:val="Compact"/>
+            </w:pPr>
+            <w:r>
+              <w:t xml:space="preserve">467 pairs; 607 species, 26 phyla</w:t>
+            </w:r>
+          </w:p>
+        </w:tc>
+        <w:tc>
+          <w:tcPr/>
+          <w:p>
+            <w:pPr>
+              <w:pStyle w:val="Compact"/>
+            </w:pPr>
+            <w:r>
+              <w:t xml:space="preserve">dnadiff ANIm</w:t>
+            </w:r>
+          </w:p>
+        </w:tc>
+        <w:tc>
+          <w:tcPr/>
+          <w:p>
+            <w:pPr>
+              <w:pStyle w:val="Compact"/>
+            </w:pPr>
+            <w:r>
+              <w:t xml:space="preserve">calibration training</w:t>
+            </w:r>
+          </w:p>
+        </w:tc>
+      </w:tr>
+      <w:tr>
+        <w:tc>
+          <w:tcPr/>
+          <w:p>
+            <w:pPr>
+              <w:pStyle w:val="Compact"/>
+            </w:pPr>
+            <w:r>
+              <w:t xml:space="preserve">10</w:t>
+            </w:r>
+          </w:p>
+        </w:tc>
+        <w:tc>
+          <w:tcPr/>
+          <w:p>
+            <w:pPr>
+              <w:pStyle w:val="Compact"/>
+            </w:pPr>
+            <w:r>
+              <w:t xml:space="preserve">GTDB scale set</w:t>
+            </w:r>
+          </w:p>
+        </w:tc>
+        <w:tc>
+          <w:tcPr/>
+          <w:p>
+            <w:pPr>
+              <w:pStyle w:val="Compact"/>
+            </w:pPr>
+            <w:r>
+              <w:t xml:space="preserve">real</w:t>
+            </w:r>
+          </w:p>
+        </w:tc>
+        <w:tc>
+          <w:tcPr/>
+          <w:p>
+            <w:pPr>
+              <w:pStyle w:val="Compact"/>
+            </w:pPr>
+            <w:r>
+              <w:t xml:space="preserve">45,000 pairs, taxonomic-level stratified</w:t>
+            </w:r>
+          </w:p>
+        </w:tc>
+        <w:tc>
+          <w:tcPr/>
+          <w:p>
+            <w:pPr>
+              <w:pStyle w:val="Compact"/>
+            </w:pPr>
+            <w:r>
+              <w:t xml:space="preserve">FastANI (672 pairs)</w:t>
+            </w:r>
+          </w:p>
+        </w:tc>
+        <w:tc>
+          <w:tcPr/>
+          <w:p>
+            <w:pPr>
+              <w:pStyle w:val="Compact"/>
+            </w:pPr>
+            <w:r>
+              <w:t xml:space="preserve">Fig. 6</w:t>
+            </w:r>
+          </w:p>
+        </w:tc>
+      </w:tr>
+      <w:tr>
+        <w:tc>
+          <w:tcPr/>
+          <w:p>
+            <w:pPr>
+              <w:pStyle w:val="Compact"/>
+            </w:pPr>
+            <w:r>
+              <w:t xml:space="preserve">11</w:t>
+            </w:r>
+          </w:p>
+        </w:tc>
+        <w:tc>
+          <w:tcPr/>
+          <w:p>
+            <w:pPr>
+              <w:pStyle w:val="Compact"/>
+            </w:pPr>
+            <w:r>
+              <w:t xml:space="preserve">Mid-ANI set</w:t>
+            </w:r>
+          </w:p>
+        </w:tc>
+        <w:tc>
+          <w:tcPr/>
+          <w:p>
+            <w:pPr>
+              <w:pStyle w:val="Compact"/>
+            </w:pPr>
+            <w:r>
+              <w:t xml:space="preserve">real</w:t>
+            </w:r>
+          </w:p>
+        </w:tc>
+        <w:tc>
+          <w:tcPr/>
+          <w:p>
+            <w:pPr>
+              <w:pStyle w:val="Compact"/>
+            </w:pPr>
+            <w:r>
+              <w:t xml:space="preserve">15 pairs, ANIm 87.6–90.2</w:t>
+            </w:r>
+          </w:p>
+        </w:tc>
+        <w:tc>
+          <w:tcPr/>
+          <w:p>
+            <w:pPr>
+              <w:pStyle w:val="Compact"/>
+            </w:pPr>
+            <w:r>
+              <w:t xml:space="preserve">dnadiff ANIm</w:t>
+            </w:r>
+          </w:p>
+        </w:tc>
+        <w:tc>
+          <w:tcPr/>
+          <w:p>
+            <w:pPr>
+              <w:pStyle w:val="Compact"/>
+            </w:pPr>
+            <w:r>
+              <w:t xml:space="preserve">Fig. 5</w:t>
+            </w:r>
+          </w:p>
+        </w:tc>
+      </w:tr>
+      <w:tr>
+        <w:tc>
+          <w:tcPr/>
+          <w:p>
+            <w:pPr>
+              <w:pStyle w:val="Compact"/>
+            </w:pPr>
+            <w:r>
+              <w:t xml:space="preserve">12</w:t>
+            </w:r>
+          </w:p>
+        </w:tc>
+        <w:tc>
+          <w:tcPr/>
+          <w:p>
+            <w:pPr>
+              <w:pStyle w:val="Compact"/>
+            </w:pPr>
+            <w:r>
+              <w:t xml:space="preserve">Oral/gut set</w:t>
+            </w:r>
+          </w:p>
+        </w:tc>
+        <w:tc>
+          <w:tcPr/>
+          <w:p>
+            <w:pPr>
+              <w:pStyle w:val="Compact"/>
+            </w:pPr>
+            <w:r>
+              <w:t xml:space="preserve">real</w:t>
+            </w:r>
+          </w:p>
+        </w:tc>
+        <w:tc>
+          <w:tcPr/>
+          <w:p>
+            <w:pPr>
+              <w:pStyle w:val="Compact"/>
+            </w:pPr>
+            <w:r>
+              <w:t xml:space="preserve">50 genomes, 10 species (5 oral + 5 gut); 1,225 pairs</w:t>
+            </w:r>
+          </w:p>
+        </w:tc>
+        <w:tc>
+          <w:tcPr/>
+          <w:p>
+            <w:pPr>
+              <w:pStyle w:val="Compact"/>
+            </w:pPr>
+            <w:r>
+              <w:t xml:space="preserve">FastANI/skani (100 same-species)</w:t>
+            </w:r>
+          </w:p>
+        </w:tc>
+        <w:tc>
+          <w:tcPr/>
+          <w:p>
+            <w:pPr>
+              <w:pStyle w:val="Compact"/>
+            </w:pPr>
+            <w:r>
+              <w:t xml:space="preserve">Results 2.6</w:t>
+            </w:r>
+          </w:p>
+        </w:tc>
+      </w:tr>
+      <w:tr>
+        <w:tc>
+          <w:tcPr/>
+          <w:p>
+            <w:pPr>
+              <w:pStyle w:val="Compact"/>
+            </w:pPr>
+            <w:r>
+              <w:t xml:space="preserve">13</w:t>
+            </w:r>
+          </w:p>
+        </w:tc>
+        <w:tc>
+          <w:tcPr/>
+          <w:p>
+            <w:pPr>
+              <w:pStyle w:val="Compact"/>
+            </w:pPr>
+            <w:r>
+              <w:t xml:space="preserve">Enterobacteriaceae completes</w:t>
+            </w:r>
+          </w:p>
+        </w:tc>
+        <w:tc>
+          <w:tcPr/>
+          <w:p>
+            <w:pPr>
+              <w:pStyle w:val="Compact"/>
+            </w:pPr>
+            <w:r>
+              <w:t xml:space="preserve">real</w:t>
+            </w:r>
+          </w:p>
+        </w:tc>
+        <w:tc>
+          <w:tcPr/>
+          <w:p>
+            <w:pPr>
+              <w:pStyle w:val="Compact"/>
+            </w:pPr>
+            <w:r>
+              <w:t xml:space="preserve">13 chromosomes vs MG1655, ANI ~81–99.99</w:t>
+            </w:r>
+          </w:p>
+        </w:tc>
+        <w:tc>
+          <w:tcPr/>
+          <w:p>
+            <w:pPr>
+              <w:pStyle w:val="Compact"/>
+            </w:pPr>
+            <w:r>
+              <w:t xml:space="preserve">dnadiff structural</w:t>
+            </w:r>
+          </w:p>
+        </w:tc>
+        <w:tc>
+          <w:tcPr/>
+          <w:p>
+            <w:pPr>
+              <w:pStyle w:val="Compact"/>
+            </w:pPr>
+            <w:r>
+              <w:t xml:space="preserve">Fig. 9</w:t>
+            </w:r>
+          </w:p>
+        </w:tc>
+      </w:tr>
+      <w:tr>
+        <w:tc>
+          <w:tcPr/>
+          <w:p>
+            <w:pPr>
+              <w:pStyle w:val="Compact"/>
+            </w:pPr>
+            <w:r>
+              <w:t xml:space="preserve">14</w:t>
+            </w:r>
+          </w:p>
+        </w:tc>
+        <w:tc>
+          <w:tcPr/>
+          <w:p>
+            <w:pPr>
+              <w:pStyle w:val="Compact"/>
+            </w:pPr>
+            <w:r>
+              <w:t xml:space="preserve">Real drafts</w:t>
+            </w:r>
+          </w:p>
+        </w:tc>
+        <w:tc>
+          <w:tcPr/>
+          <w:p>
+            <w:pPr>
+              <w:pStyle w:val="Compact"/>
+            </w:pPr>
+            <w:r>
+              <w:t xml:space="preserve">real</w:t>
+            </w:r>
+          </w:p>
+        </w:tc>
+        <w:tc>
+          <w:tcPr/>
+          <w:p>
+            <w:pPr>
+              <w:pStyle w:val="Compact"/>
+            </w:pPr>
+            <w:r>
+              <w:t xml:space="preserve">8 E. coli assemblies, 88–8,025 contigs; RC controls</w:t>
+            </w:r>
+          </w:p>
+        </w:tc>
+        <w:tc>
+          <w:tcPr/>
+          <w:p>
+            <w:pPr>
+              <w:pStyle w:val="Compact"/>
+            </w:pPr>
+            <w:r>
+              <w:t xml:space="preserve">complete-genome reference</w:t>
+            </w:r>
+          </w:p>
+        </w:tc>
+        <w:tc>
+          <w:tcPr/>
+          <w:p>
+            <w:pPr>
+              <w:pStyle w:val="Compact"/>
+            </w:pPr>
+            <w:r>
+              <w:t xml:space="preserve">Results 2.3, Fig. 7</w:t>
+            </w:r>
+          </w:p>
+        </w:tc>
+      </w:tr>
+      <w:tr>
+        <w:tc>
+          <w:tcPr/>
+          <w:p>
+            <w:pPr>
+              <w:pStyle w:val="Compact"/>
+            </w:pPr>
+            <w:r>
+              <w:t xml:space="preserve">15</w:t>
+            </w:r>
+          </w:p>
+        </w:tc>
+        <w:tc>
+          <w:tcPr/>
+          <w:p>
+            <w:pPr>
+              <w:pStyle w:val="Compact"/>
+            </w:pPr>
+            <w:r>
+              <w:t xml:space="preserve">CAMI2 MAG benchmark</w:t>
+            </w:r>
+          </w:p>
+        </w:tc>
+        <w:tc>
+          <w:tcPr/>
+          <w:p>
+            <w:pPr>
+              <w:pStyle w:val="Compact"/>
+            </w:pPr>
+            <w:r>
+              <w:t xml:space="preserve">real metagenomes</w:t>
+            </w:r>
+          </w:p>
+        </w:tc>
+        <w:tc>
+          <w:tcPr/>
+          <w:p>
+            <w:pPr>
+              <w:pStyle w:val="Compact"/>
+            </w:pPr>
+            <w:r>
+              <w:t xml:space="preserve">35 samples → 695 bins ≥ 100 kbp</w:t>
+            </w:r>
+          </w:p>
+        </w:tc>
+        <w:tc>
+          <w:tcPr/>
+          <w:p>
+            <w:pPr>
+              <w:pStyle w:val="Compact"/>
+            </w:pPr>
+            <w:r>
+              <w:t xml:space="preserve">dnadiff ANIm + CAMI2 assignment</w:t>
+            </w:r>
+          </w:p>
+        </w:tc>
+        <w:tc>
+          <w:tcPr/>
+          <w:p>
+            <w:pPr>
+              <w:pStyle w:val="Compact"/>
+            </w:pPr>
+            <w:r>
+              <w:t xml:space="preserve">Fig. 10</w:t>
             </w:r>
           </w:p>
         </w:tc>

</xml_diff>

<commit_message>
Fix dataset ordering in Methods 4.10: place held-out benchmark (9) with the other real datasets before the Databases paragraph
</commit_message>
<xml_diff>
--- a/paper/manuscript.docx
+++ b/paper/manuscript.docx
@@ -3247,41 +3247,41 @@
           <w:b/>
           <w:bCs/>
         </w:rPr>
+        <w:t xml:space="preserve">(9) GTDB 50k held-out benchmark.</w:t>
+      </w:r>
+      <w:r>
+        <w:t xml:space="preserve"> </w:t>
+      </w:r>
+      <w:r>
+        <w:t xml:space="preserve">43,334 same-genus pairs sampled from the 628,617 non-self GTDB-R207 representative pairs that pass a skani pre-screen (AF ≥ 15%), stratified into bands 80–85 / 85–90 / 90–95 / 95–100% (12,172 / 16,000 / 14,758 / 404 pairs; 24,831 genomes, 74 phyla;</w:t>
+      </w:r>
+      <w:r>
+        <w:t xml:space="preserve"> </w:t>
+      </w:r>
+      <w:r>
+        <w:rPr>
+          <w:rStyle w:val="VerbatimChar"/>
+        </w:rPr>
+        <w:t xml:space="preserve">scripts/gtdb50k/</w:t>
+      </w:r>
+      <w:r>
+        <w:t xml:space="preserve">). Every genome appearing in the 2,520-pair calibration training matrix was excluded in both directions, making this a strictly held-out set for the gate, flag, and calibration; dnadiff/ANIm truth was computed for all 43,334 pairs on the HPC cluster.</w:t>
+      </w:r>
+      <w:r>
+        <w:t xml:space="preserve"> </w:t>
+      </w:r>
+      <w:r>
+        <w:rPr>
+          <w:b/>
+          <w:bCs/>
+        </w:rPr>
         <w:t xml:space="preserve">Databases.</w:t>
       </w:r>
       <w:r>
         <w:t xml:space="preserve"> </w:t>
       </w:r>
       <w:r>
-        <w:t xml:space="preserve">GTDB release R207 (bac120/ar53 metadata and representative genomes) [11,12] is the sampling frame for datasets (1)–(3) and the source of the nearest-representative references used in the MAG pipeline; CAMI2 (strain-madness and marine short-read campaigns, with source genomes and per-read ground truth) is the sampling frame for dataset (8).</w:t>
-      </w:r>
-      <w:r>
-        <w:t xml:space="preserve"> </w:t>
-      </w:r>
-      <w:r>
-        <w:rPr>
-          <w:b/>
-          <w:bCs/>
-        </w:rPr>
-        <w:t xml:space="preserve">(9) GTDB 50k held-out benchmark.</w:t>
-      </w:r>
-      <w:r>
-        <w:t xml:space="preserve"> </w:t>
-      </w:r>
-      <w:r>
-        <w:t xml:space="preserve">43,334 same-genus pairs sampled from the 628,617 non-self GTDB-R207 representative pairs that pass a skani pre-screen (AF ≥ 15%), stratified into bands 80–85 / 85–90 / 90–95 / 95–100% (12,172 / 16,000 / 14,758 / 404 pairs; 24,831 genomes, 74 phyla;</w:t>
-      </w:r>
-      <w:r>
-        <w:t xml:space="preserve"> </w:t>
-      </w:r>
-      <w:r>
-        <w:rPr>
-          <w:rStyle w:val="VerbatimChar"/>
-        </w:rPr>
-        <w:t xml:space="preserve">scripts/gtdb50k/</w:t>
-      </w:r>
-      <w:r>
-        <w:t xml:space="preserve">). Every genome appearing in the 2,520-pair calibration training matrix was excluded in both directions, making this a strictly held-out set for the gate, flag, and calibration; dnadiff/ANIm truth was computed for all 43,334 pairs on the HPC cluster.</w:t>
+        <w:t xml:space="preserve">GTDB release R207 (bac120/ar53 metadata and representative genomes) [11,12] is the sampling frame for datasets (1)–(3) and (9) and the source of the nearest-representative references used in the MAG pipeline; CAMI2 (strain-madness and marine short-read campaigns, with source genomes and per-read ground truth) is the sampling frame for dataset (8).</w:t>
       </w:r>
       <w:r>
         <w:t xml:space="preserve"> </w:t>

</xml_diff>